<commit_message>
Fix feature cross-references in the release backlog
Co-Authored-By: Claude Opus 5.5 <noreply@anthropic.com>
Claude-Session: https://claude.ai/code/session_01FRM7gnnA9AXrzoXHdE9dQs
</commit_message>
<xml_diff>
--- a/docs/business-analysis/backlog/Manih-Release-Backlog.docx
+++ b/docs/business-analysis/backlog/Manih-Release-Backlog.docx
@@ -15733,7 +15733,7 @@
                 <w:sz w:val="19"/>
                 <w:szCs w:val="19"/>
               </w:rPr>
-              <w:t>Splitting one application into several projects → F30C</w:t>
+              <w:t>Splitting one application into several projects → F33</w:t>
             </w:r>
           </w:p>
         </w:tc>
@@ -16688,7 +16688,7 @@
                 <w:sz w:val="19"/>
                 <w:szCs w:val="19"/>
               </w:rPr>
-              <w:t>Indicators → F30C</w:t>
+              <w:t>Indicators → F33</w:t>
             </w:r>
           </w:p>
         </w:tc>

</xml_diff>